<commit_message>
Quick content fixes from the content review
- Remove a leftover ChatGPT citation from the generator inspection SOP
- Fix nav links #advisory -> #expertise, label Focus Areas
- New share image (og-image.png): name and subject only, site colours
- Neutral asset tags: OSL-DC1-... -> SITE1-B1-...
- Library: examples are written for this site, not anonymized; footer Based in Norway
- Templates page: four templates; SOP template no longer pre-filled with UPS text
- README: personal website
- Remove leftover test files, the empty examples page and duplicate documents/

Co-Authored-By: Claude Opus 5.5 <noreply@anthropic.com>
</commit_message>
<xml_diff>
--- a/operational/templates/SOP_Template_v1.docx
+++ b/operational/templates/SOP_Template_v1.docx
@@ -12,7 +12,7 @@
           <w:color w:val="192337"/>
           <w:sz w:val="48"/>
         </w:rPr>
-        <w:t>UPS Maintenance Bypass Operation</w:t>
+        <w:t>Standard Operating Procedure (SOP) Template</w:t>
       </w:r>
     </w:p>
     <w:p>
@@ -23,7 +23,7 @@
         <w:rPr>
           <w:i/>
         </w:rPr>
-        <w:t>Professional SOP Template — Empty Operational Structure</w:t>
+        <w:t>Empty SOP structure for recurring tasks</w:t>
       </w:r>
     </w:p>
     <w:p/>
@@ -159,7 +159,7 @@
         <w:rPr>
           <w:i/>
         </w:rPr>
-        <w:t>Define the controlled process for transferring a UPS system into maintenance bypass mode while minimizing operational risk to protected critical loads.</w:t>
+        <w:t>Describe the recurring task this procedure covers and why it is done.</w:t>
       </w:r>
     </w:p>
     <w:p>
@@ -192,7 +192,7 @@
         <w:rPr>
           <w:i/>
         </w:rPr>
-        <w:t>Applies to planned maintenance activities involving UPS systems supporting critical infrastructure environments.</w:t>
+        <w:t>Define which systems, locations and situations the procedure applies to.</w:t>
       </w:r>
     </w:p>
     <w:p>
@@ -274,7 +274,7 @@
         <w:t xml:space="preserve">☐ </w:t>
       </w:r>
       <w:r>
-        <w:t>Approved maintenance window</w:t>
+        <w:t>Required access and approvals in place</w:t>
       </w:r>
     </w:p>
     <w:p>
@@ -285,7 +285,7 @@
         <w:t xml:space="preserve">☐ </w:t>
       </w:r>
       <w:r>
-        <w:t>Change authorization completed</w:t>
+        <w:t>Required tools and PPE available</w:t>
       </w:r>
     </w:p>
     <w:p>
@@ -296,7 +296,7 @@
         <w:t xml:space="preserve">☐ </w:t>
       </w:r>
       <w:r>
-        <w:t>Relevant stakeholders informed</w:t>
+        <w:t>Relevant people informed</w:t>
       </w:r>
     </w:p>
     <w:p>
@@ -307,7 +307,7 @@
         <w:t xml:space="preserve">☐ </w:t>
       </w:r>
       <w:r>
-        <w:t>No active infrastructure alarms affecting redundancy</w:t>
+        <w:t>No active alarms affecting the task</w:t>
       </w:r>
     </w:p>
     <w:p>
@@ -318,7 +318,7 @@
         <w:t xml:space="preserve">☐ </w:t>
       </w:r>
       <w:r>
-        <w:t>Generator systems verified available</w:t>
+        <w:t>Supporting systems verified available</w:t>
       </w:r>
     </w:p>
     <w:p>
@@ -329,7 +329,7 @@
         <w:t xml:space="preserve">☐ </w:t>
       </w:r>
       <w:r>
-        <w:t>Operational monitoring active</w:t>
+        <w:t>Monitoring active</w:t>
       </w:r>
     </w:p>
     <w:p/>

</xml_diff>